<commit_message>
chore: save final project changes
</commit_message>
<xml_diff>
--- a/Файлы/ТЗ_Хакатон_ПРОСТОР (финал)-1.docx
+++ b/Файлы/ТЗ_Хакатон_ПРОСТОР (финал)-1.docx
@@ -293,27 +293,7 @@
           <w:sz w:val="24"/>
           <w:szCs w:val="24"/>
         </w:rPr>
-        <w:t xml:space="preserve">В рамках </w:t>
-      </w:r>
-      <w:proofErr w:type="spellStart"/>
-      <w:r>
-        <w:rPr>
-          <w:rFonts w:ascii="Arial" w:eastAsia="Arial" w:hAnsi="Arial" w:cs="Arial"/>
-          <w:color w:val="000000" w:themeColor="text1"/>
-          <w:sz w:val="24"/>
-          <w:szCs w:val="24"/>
-        </w:rPr>
-        <w:t>хакатона</w:t>
-      </w:r>
-      <w:proofErr w:type="spellEnd"/>
-      <w:r>
-        <w:rPr>
-          <w:rFonts w:ascii="Arial" w:eastAsia="Arial" w:hAnsi="Arial" w:cs="Arial"/>
-          <w:color w:val="000000" w:themeColor="text1"/>
-          <w:sz w:val="24"/>
-          <w:szCs w:val="24"/>
-        </w:rPr>
-        <w:t xml:space="preserve"> каждая команда реализует решение сразу по двум кейсам: "Умный конструктор технического задания" (Кейс 1) и "ИИ-агент умного поиска" (Кейс 2). Оба модуля должны функционировать в рамках единого приложения с общей навигацией. Кейс 2 предусматривает интеграцию с Кейсом 1: по результатам диалога с ИИ-агентом пользователь должен иметь возможность перейти к формированию ТЗ в конструкторе.</w:t>
+        <w:t>В рамках хакатона каждая команда реализует решение сразу по двум кейсам: "Умный конструктор технического задания" (Кейс 1) и "ИИ-агент умного поиска" (Кейс 2). Оба модуля должны функционировать в рамках единого приложения с общей навигацией. Кейс 2 предусматривает интеграцию с Кейсом 1: по результатам диалога с ИИ-агентом пользователь должен иметь возможность перейти к формированию ТЗ в конструкторе.</w:t>
       </w:r>
     </w:p>
     <w:p>
@@ -357,69 +337,8 @@
           <w:sz w:val="24"/>
           <w:szCs w:val="24"/>
         </w:rPr>
-        <w:t xml:space="preserve">Участники формируют команды в составе от 3 до 5 человек. Рекомендуемое распределение ролей: </w:t>
+        <w:t>Участники формируют команды в составе от 3 до 5 человек. Рекомендуемое распределение ролей: backend-разработчик, frontend-разработчик, ML/Data-инженер (при наличии компетенций), аналитик/тестировщик, техлидер (менеджер продукта).</w:t>
       </w:r>
-      <w:proofErr w:type="spellStart"/>
-      <w:r>
-        <w:rPr>
-          <w:rFonts w:ascii="Arial" w:eastAsia="Arial" w:hAnsi="Arial" w:cs="Arial"/>
-          <w:color w:val="000000" w:themeColor="text1"/>
-          <w:sz w:val="24"/>
-          <w:szCs w:val="24"/>
-        </w:rPr>
-        <w:t>backend</w:t>
-      </w:r>
-      <w:proofErr w:type="spellEnd"/>
-      <w:r>
-        <w:rPr>
-          <w:rFonts w:ascii="Arial" w:eastAsia="Arial" w:hAnsi="Arial" w:cs="Arial"/>
-          <w:color w:val="000000" w:themeColor="text1"/>
-          <w:sz w:val="24"/>
-          <w:szCs w:val="24"/>
-        </w:rPr>
-        <w:t xml:space="preserve">-разработчик, </w:t>
-      </w:r>
-      <w:proofErr w:type="spellStart"/>
-      <w:r>
-        <w:rPr>
-          <w:rFonts w:ascii="Arial" w:eastAsia="Arial" w:hAnsi="Arial" w:cs="Arial"/>
-          <w:color w:val="000000" w:themeColor="text1"/>
-          <w:sz w:val="24"/>
-          <w:szCs w:val="24"/>
-        </w:rPr>
-        <w:t>frontend</w:t>
-      </w:r>
-      <w:proofErr w:type="spellEnd"/>
-      <w:r>
-        <w:rPr>
-          <w:rFonts w:ascii="Arial" w:eastAsia="Arial" w:hAnsi="Arial" w:cs="Arial"/>
-          <w:color w:val="000000" w:themeColor="text1"/>
-          <w:sz w:val="24"/>
-          <w:szCs w:val="24"/>
-        </w:rPr>
-        <w:t xml:space="preserve">-разработчик, ML/Data-инженер (при наличии компетенций), аналитик/тестировщик, </w:t>
-      </w:r>
-      <w:proofErr w:type="spellStart"/>
-      <w:r>
-        <w:rPr>
-          <w:rFonts w:ascii="Arial" w:eastAsia="Arial" w:hAnsi="Arial" w:cs="Arial"/>
-          <w:color w:val="000000" w:themeColor="text1"/>
-          <w:sz w:val="24"/>
-          <w:szCs w:val="24"/>
-        </w:rPr>
-        <w:t>техлидер</w:t>
-      </w:r>
-      <w:proofErr w:type="spellEnd"/>
-      <w:r>
-        <w:rPr>
-          <w:rFonts w:ascii="Arial" w:eastAsia="Arial" w:hAnsi="Arial" w:cs="Arial"/>
-          <w:color w:val="000000" w:themeColor="text1"/>
-          <w:sz w:val="24"/>
-          <w:szCs w:val="24"/>
-        </w:rPr>
-        <w:t xml:space="preserve"> (менеджер продукта).</w:t>
-      </w:r>
-      <w:proofErr w:type="spellStart"/>
       <w:r>
         <w:rPr>
           <w:rFonts w:ascii="Arial" w:eastAsia="Arial" w:hAnsi="Arial" w:cs="Arial"/>
@@ -430,7 +349,6 @@
         </w:rPr>
         <w:t>gi</w:t>
       </w:r>
-      <w:proofErr w:type="spellEnd"/>
     </w:p>
     <w:p>
       <w:pPr>
@@ -1104,17 +1022,9 @@
           <w:rStyle w:val="40"/>
         </w:rPr>
         <w:lastRenderedPageBreak/>
-        <w:t xml:space="preserve">Кейс 2. ИИ-агент умного поиска в </w:t>
-      </w:r>
-      <w:proofErr w:type="spellStart"/>
-      <w:r>
-        <w:rPr>
-          <w:rStyle w:val="40"/>
-        </w:rPr>
-        <w:t>ПРОСТОРе</w:t>
+        <w:t>Кейс 2. ИИ-агент умного поиска в ПРОСТОРе</w:t>
       </w:r>
       <w:bookmarkEnd w:id="10"/>
-      <w:proofErr w:type="spellEnd"/>
     </w:p>
     <w:p>
       <w:pPr>
@@ -1555,27 +1465,7 @@
           <w:sz w:val="24"/>
           <w:szCs w:val="24"/>
         </w:rPr>
-        <w:t xml:space="preserve">Переход из чат-интерфейса к формированию ТЗ в конструкторе (Кейс 1) с </w:t>
-      </w:r>
-      <w:proofErr w:type="spellStart"/>
-      <w:r>
-        <w:rPr>
-          <w:rFonts w:ascii="Arial" w:eastAsia="Arial" w:hAnsi="Arial" w:cs="Arial"/>
-          <w:color w:val="FF0000"/>
-          <w:sz w:val="24"/>
-          <w:szCs w:val="24"/>
-        </w:rPr>
-        <w:t>предзаполненными</w:t>
-      </w:r>
-      <w:proofErr w:type="spellEnd"/>
-      <w:r>
-        <w:rPr>
-          <w:rFonts w:ascii="Arial" w:eastAsia="Arial" w:hAnsi="Arial" w:cs="Arial"/>
-          <w:color w:val="FF0000"/>
-          <w:sz w:val="24"/>
-          <w:szCs w:val="24"/>
-        </w:rPr>
-        <w:t xml:space="preserve"> данными из диалога.</w:t>
+        <w:t>Переход из чат-интерфейса к формированию ТЗ в конструкторе (Кейс 1) с предзаполненными данными из диалога.</w:t>
       </w:r>
     </w:p>
     <w:p>
@@ -1610,7 +1500,7 @@
           <w:sz w:val="24"/>
           <w:szCs w:val="24"/>
         </w:rPr>
-        <w:t xml:space="preserve">где будут определенные условия </w:t>
+        <w:t>где будут определенные условия</w:t>
       </w:r>
     </w:p>
     <w:p>
@@ -1665,27 +1555,7 @@
           <w:sz w:val="24"/>
           <w:szCs w:val="24"/>
         </w:rPr>
-        <w:t xml:space="preserve">Интеллектуальный агент должен функционировать не как классическая система полнотекстового поиска, а как консультант по подбору услуг. Основная задача — не выявление формальных совпадений, а содействие заказчику в принятии обоснованного решения. Критически важной является интеграция с Кейсом 1: по результатам диалога с ИИ-агентом пользователь должен иметь возможность перейти непосредственно к формированию ТЗ в конструкторе, при этом выбранные услуги, этапы и параметры из диалога автоматически переносятся и </w:t>
-      </w:r>
-      <w:proofErr w:type="spellStart"/>
-      <w:r>
-        <w:rPr>
-          <w:rFonts w:ascii="Arial" w:eastAsia="Arial" w:hAnsi="Arial" w:cs="Arial"/>
-          <w:color w:val="000000" w:themeColor="text1"/>
-          <w:sz w:val="24"/>
-          <w:szCs w:val="24"/>
-        </w:rPr>
-        <w:t>предзаполняют</w:t>
-      </w:r>
-      <w:proofErr w:type="spellEnd"/>
-      <w:r>
-        <w:rPr>
-          <w:rFonts w:ascii="Arial" w:eastAsia="Arial" w:hAnsi="Arial" w:cs="Arial"/>
-          <w:color w:val="000000" w:themeColor="text1"/>
-          <w:sz w:val="24"/>
-          <w:szCs w:val="24"/>
-        </w:rPr>
-        <w:t xml:space="preserve"> соответствующие поля конструктора.</w:t>
+        <w:t>Интеллектуальный агент должен функционировать не как классическая система полнотекстового поиска, а как консультант по подбору услуг. Основная задача — не выявление формальных совпадений, а содействие заказчику в принятии обоснованного решения. Критически важной является интеграция с Кейсом 1: по результатам диалога с ИИ-агентом пользователь должен иметь возможность перейти непосредственно к формированию ТЗ в конструкторе, при этом выбранные услуги, этапы и параметры из диалога автоматически переносятся и предзаполняют соответствующие поля конструктора.</w:t>
       </w:r>
     </w:p>
     <w:p>
@@ -1705,27 +1575,7 @@
           <w:sz w:val="24"/>
           <w:szCs w:val="24"/>
         </w:rPr>
-        <w:t xml:space="preserve">Пример взаимодействия: заказчик формулирует запрос "Нужно оценить запасы по объекту" — система предлагает услугу "Подсчет запасов", перечисляет необходимые исходные данные, формирует список из трех исполнителей с соответствующим опытом, отображает перечень связанных услуг и предоставляет кнопку "Сформировать ТЗ". При нажатии пользователь переходит в конструктор ТЗ (Кейс 1), где тип работ, этапы и требования уже </w:t>
-      </w:r>
-      <w:proofErr w:type="spellStart"/>
-      <w:r>
-        <w:rPr>
-          <w:rFonts w:ascii="Arial" w:eastAsia="Arial" w:hAnsi="Arial" w:cs="Arial"/>
-          <w:color w:val="000000" w:themeColor="text1"/>
-          <w:sz w:val="24"/>
-          <w:szCs w:val="24"/>
-        </w:rPr>
-        <w:t>предзаполнены</w:t>
-      </w:r>
-      <w:proofErr w:type="spellEnd"/>
-      <w:r>
-        <w:rPr>
-          <w:rFonts w:ascii="Arial" w:eastAsia="Arial" w:hAnsi="Arial" w:cs="Arial"/>
-          <w:color w:val="000000" w:themeColor="text1"/>
-          <w:sz w:val="24"/>
-          <w:szCs w:val="24"/>
-        </w:rPr>
-        <w:t xml:space="preserve"> на основании диалога.</w:t>
+        <w:t>Пример взаимодействия: заказчик формулирует запрос "Нужно оценить запасы по объекту" — система предлагает услугу "Подсчет запасов", перечисляет необходимые исходные данные, формирует список из трех исполнителей с соответствующим опытом, отображает перечень связанных услуг и предоставляет кнопку "Сформировать ТЗ". При нажатии пользователь переходит в конструктор ТЗ (Кейс 1), где тип работ, этапы и требования уже предзаполнены на основании диалога.</w:t>
       </w:r>
     </w:p>
     <w:p>
@@ -2168,51 +2018,7 @@
           <w:sz w:val="24"/>
           <w:szCs w:val="24"/>
         </w:rPr>
-        <w:t>Демо работающего приложения (MVP) - исходный код решения должен быть размещен в публичном репозитории (</w:t>
-      </w:r>
-      <w:proofErr w:type="spellStart"/>
-      <w:r>
-        <w:rPr>
-          <w:rFonts w:ascii="Arial" w:eastAsia="Arial" w:hAnsi="Arial" w:cs="Arial"/>
-          <w:b w:val="0"/>
-          <w:color w:val="000000" w:themeColor="text1"/>
-          <w:sz w:val="24"/>
-          <w:szCs w:val="24"/>
-        </w:rPr>
-        <w:t>GitHub</w:t>
-      </w:r>
-      <w:proofErr w:type="spellEnd"/>
-      <w:r>
-        <w:rPr>
-          <w:rFonts w:ascii="Arial" w:eastAsia="Arial" w:hAnsi="Arial" w:cs="Arial"/>
-          <w:b w:val="0"/>
-          <w:color w:val="000000" w:themeColor="text1"/>
-          <w:sz w:val="24"/>
-          <w:szCs w:val="24"/>
-        </w:rPr>
-        <w:t xml:space="preserve">, </w:t>
-      </w:r>
-      <w:proofErr w:type="spellStart"/>
-      <w:r>
-        <w:rPr>
-          <w:rFonts w:ascii="Arial" w:eastAsia="Arial" w:hAnsi="Arial" w:cs="Arial"/>
-          <w:b w:val="0"/>
-          <w:color w:val="000000" w:themeColor="text1"/>
-          <w:sz w:val="24"/>
-          <w:szCs w:val="24"/>
-        </w:rPr>
-        <w:t>GitLab</w:t>
-      </w:r>
-      <w:proofErr w:type="spellEnd"/>
-      <w:r>
-        <w:rPr>
-          <w:rFonts w:ascii="Arial" w:eastAsia="Arial" w:hAnsi="Arial" w:cs="Arial"/>
-          <w:b w:val="0"/>
-          <w:color w:val="000000" w:themeColor="text1"/>
-          <w:sz w:val="24"/>
-          <w:szCs w:val="24"/>
-        </w:rPr>
-        <w:t>), доступы предоставлены экспертной группе;</w:t>
+        <w:t>Демо работающего приложения (MVP) - исходный код решения должен быть размещен в публичном репозитории (GitHub, GitLab), доступы предоставлены экспертной группе;</w:t>
       </w:r>
     </w:p>
     <w:p>
@@ -2428,27 +2234,7 @@
           <w:sz w:val="24"/>
           <w:szCs w:val="24"/>
         </w:rPr>
-        <w:t xml:space="preserve">Дополнительные балы могут быть получены при наличии тестов (API, UI, </w:t>
-      </w:r>
-      <w:proofErr w:type="spellStart"/>
-      <w:r>
-        <w:rPr>
-          <w:rFonts w:ascii="Arial" w:hAnsi="Arial" w:cs="Arial"/>
-          <w:color w:val="000000" w:themeColor="text1"/>
-          <w:sz w:val="24"/>
-          <w:szCs w:val="24"/>
-        </w:rPr>
-        <w:t>unit</w:t>
-      </w:r>
-      <w:proofErr w:type="spellEnd"/>
-      <w:r>
-        <w:rPr>
-          <w:rFonts w:ascii="Arial" w:hAnsi="Arial" w:cs="Arial"/>
-          <w:color w:val="000000" w:themeColor="text1"/>
-          <w:sz w:val="24"/>
-          <w:szCs w:val="24"/>
-        </w:rPr>
-        <w:t>)</w:t>
+        <w:t>Дополнительные балы могут быть получены при наличии тестов (API, UI, unit)</w:t>
       </w:r>
     </w:p>
     <w:p>
@@ -2528,47 +2314,7 @@
           <w:sz w:val="24"/>
           <w:szCs w:val="24"/>
         </w:rPr>
-        <w:t xml:space="preserve"> ограничения и допущения; пользовательские сценарии (</w:t>
-      </w:r>
-      <w:proofErr w:type="spellStart"/>
-      <w:r>
-        <w:rPr>
-          <w:rFonts w:ascii="Arial" w:eastAsia="Arial" w:hAnsi="Arial" w:cs="Arial"/>
-          <w:color w:val="000000" w:themeColor="text1"/>
-          <w:sz w:val="24"/>
-          <w:szCs w:val="24"/>
-        </w:rPr>
-        <w:t>use</w:t>
-      </w:r>
-      <w:proofErr w:type="spellEnd"/>
-      <w:r>
-        <w:rPr>
-          <w:rFonts w:ascii="Arial" w:eastAsia="Arial" w:hAnsi="Arial" w:cs="Arial"/>
-          <w:color w:val="000000" w:themeColor="text1"/>
-          <w:sz w:val="24"/>
-          <w:szCs w:val="24"/>
-        </w:rPr>
-        <w:t xml:space="preserve"> </w:t>
-      </w:r>
-      <w:proofErr w:type="spellStart"/>
-      <w:r>
-        <w:rPr>
-          <w:rFonts w:ascii="Arial" w:eastAsia="Arial" w:hAnsi="Arial" w:cs="Arial"/>
-          <w:color w:val="000000" w:themeColor="text1"/>
-          <w:sz w:val="24"/>
-          <w:szCs w:val="24"/>
-        </w:rPr>
-        <w:t>cases</w:t>
-      </w:r>
-      <w:proofErr w:type="spellEnd"/>
-      <w:r>
-        <w:rPr>
-          <w:rFonts w:ascii="Arial" w:eastAsia="Arial" w:hAnsi="Arial" w:cs="Arial"/>
-          <w:color w:val="000000" w:themeColor="text1"/>
-          <w:sz w:val="24"/>
-          <w:szCs w:val="24"/>
-        </w:rPr>
-        <w:t>); перечень функциональности, запланированной к реализации на последующих итерациях.</w:t>
+        <w:t xml:space="preserve"> ограничения и допущения; пользовательские сценарии (use cases); перечень функциональности, запланированной к реализации на последующих итерациях.</w:t>
       </w:r>
     </w:p>
     <w:p>
@@ -2750,27 +2496,7 @@
           <w:sz w:val="24"/>
           <w:szCs w:val="24"/>
         </w:rPr>
-        <w:t xml:space="preserve">Выгрузка из системы – набор данных, в том числе справочных из системы ПРОСТОР (формат </w:t>
-      </w:r>
-      <w:proofErr w:type="spellStart"/>
-      <w:r>
-        <w:rPr>
-          <w:rFonts w:ascii="Arial" w:hAnsi="Arial" w:cs="Arial"/>
-          <w:color w:val="000000" w:themeColor="text1"/>
-          <w:sz w:val="24"/>
-          <w:szCs w:val="24"/>
-        </w:rPr>
-        <w:t>xlsx</w:t>
-      </w:r>
-      <w:proofErr w:type="spellEnd"/>
-      <w:r>
-        <w:rPr>
-          <w:rFonts w:ascii="Arial" w:hAnsi="Arial" w:cs="Arial"/>
-          <w:color w:val="000000" w:themeColor="text1"/>
-          <w:sz w:val="24"/>
-          <w:szCs w:val="24"/>
-        </w:rPr>
-        <w:t>)</w:t>
+        <w:t>Выгрузка из системы – набор данных, в том числе справочных из системы ПРОСТОР (формат xlsx)</w:t>
       </w:r>
     </w:p>
     <w:p>
@@ -2796,47 +2522,7 @@
           <w:sz w:val="24"/>
           <w:szCs w:val="24"/>
         </w:rPr>
-        <w:t>Шаблоны ТЗ – примеры сформированных технических заданий, приложений и комплектов документов (</w:t>
-      </w:r>
-      <w:proofErr w:type="spellStart"/>
-      <w:r>
-        <w:rPr>
-          <w:rFonts w:ascii="Arial" w:hAnsi="Arial" w:cs="Arial"/>
-          <w:color w:val="000000" w:themeColor="text1"/>
-          <w:sz w:val="24"/>
-          <w:szCs w:val="24"/>
-        </w:rPr>
-        <w:t>docx</w:t>
-      </w:r>
-      <w:proofErr w:type="spellEnd"/>
-      <w:r>
-        <w:rPr>
-          <w:rFonts w:ascii="Arial" w:hAnsi="Arial" w:cs="Arial"/>
-          <w:color w:val="000000" w:themeColor="text1"/>
-          <w:sz w:val="24"/>
-          <w:szCs w:val="24"/>
-        </w:rPr>
-        <w:t xml:space="preserve">, </w:t>
-      </w:r>
-      <w:proofErr w:type="spellStart"/>
-      <w:r>
-        <w:rPr>
-          <w:rFonts w:ascii="Arial" w:hAnsi="Arial" w:cs="Arial"/>
-          <w:color w:val="000000" w:themeColor="text1"/>
-          <w:sz w:val="24"/>
-          <w:szCs w:val="24"/>
-        </w:rPr>
-        <w:t>xlsx</w:t>
-      </w:r>
-      <w:proofErr w:type="spellEnd"/>
-      <w:r>
-        <w:rPr>
-          <w:rFonts w:ascii="Arial" w:hAnsi="Arial" w:cs="Arial"/>
-          <w:color w:val="000000" w:themeColor="text1"/>
-          <w:sz w:val="24"/>
-          <w:szCs w:val="24"/>
-        </w:rPr>
-        <w:t>)</w:t>
+        <w:t>Шаблоны ТЗ – примеры сформированных технических заданий, приложений и комплектов документов (docx, xlsx)</w:t>
       </w:r>
     </w:p>
     <w:p>
@@ -2935,30 +2621,8 @@
         <w:rPr>
           <w:rFonts w:ascii="Arial" w:eastAsia="Arial" w:hAnsi="Arial" w:cs="Arial"/>
         </w:rPr>
-        <w:t xml:space="preserve">возможно </w:t>
+        <w:t>возможно смапить с требованиям на 1й странице? или перенести их сюда оставив инфо без дубирования</w:t>
       </w:r>
-      <w:proofErr w:type="spellStart"/>
-      <w:r>
-        <w:rPr>
-          <w:rFonts w:ascii="Arial" w:eastAsia="Arial" w:hAnsi="Arial" w:cs="Arial"/>
-        </w:rPr>
-        <w:t>смапить</w:t>
-      </w:r>
-      <w:proofErr w:type="spellEnd"/>
-      <w:r>
-        <w:rPr>
-          <w:rFonts w:ascii="Arial" w:eastAsia="Arial" w:hAnsi="Arial" w:cs="Arial"/>
-        </w:rPr>
-        <w:t xml:space="preserve"> с требованиям на 1й странице? или перенести их сюда оставив инфо без </w:t>
-      </w:r>
-      <w:proofErr w:type="spellStart"/>
-      <w:r>
-        <w:rPr>
-          <w:rFonts w:ascii="Arial" w:eastAsia="Arial" w:hAnsi="Arial" w:cs="Arial"/>
-        </w:rPr>
-        <w:t>дубирования</w:t>
-      </w:r>
-      <w:proofErr w:type="spellEnd"/>
     </w:p>
   </w:comment>
   <w:comment w:id="20" w:author="salikhova.rr" w:date="2026-08-13T15:00:00Z" w:initials="s">
@@ -2981,21 +2645,7 @@
         <w:rPr>
           <w:rFonts w:ascii="Arial" w:eastAsia="Arial" w:hAnsi="Arial" w:cs="Arial"/>
         </w:rPr>
-        <w:t xml:space="preserve">можно заложить в виде требования по хранению артефактов в </w:t>
-      </w:r>
-      <w:proofErr w:type="spellStart"/>
-      <w:r>
-        <w:rPr>
-          <w:rFonts w:ascii="Arial" w:eastAsia="Arial" w:hAnsi="Arial" w:cs="Arial"/>
-        </w:rPr>
-        <w:t>репо</w:t>
-      </w:r>
-      <w:proofErr w:type="spellEnd"/>
-      <w:r>
-        <w:rPr>
-          <w:rFonts w:ascii="Arial" w:eastAsia="Arial" w:hAnsi="Arial" w:cs="Arial"/>
-        </w:rPr>
-        <w:t xml:space="preserve"> с предоставлением доступа к ТУЗ (создать ее, раздать экспертам)</w:t>
+        <w:t>можно заложить в виде требования по хранению артефактов в репо с предоставлением доступа к ТУЗ (создать ее, раздать экспертам)</w:t>
       </w:r>
     </w:p>
   </w:comment>
@@ -3008,35 +2658,7 @@
         <w:rPr>
           <w:rFonts w:ascii="Arial" w:eastAsia="Arial" w:hAnsi="Arial" w:cs="Arial"/>
         </w:rPr>
-        <w:t xml:space="preserve">можно добавить требование по покрытию тестами (на любом слое: </w:t>
-      </w:r>
-      <w:proofErr w:type="spellStart"/>
-      <w:r>
-        <w:rPr>
-          <w:rFonts w:ascii="Arial" w:eastAsia="Arial" w:hAnsi="Arial" w:cs="Arial"/>
-        </w:rPr>
-        <w:t>апи</w:t>
-      </w:r>
-      <w:proofErr w:type="spellEnd"/>
-      <w:r>
-        <w:rPr>
-          <w:rFonts w:ascii="Arial" w:eastAsia="Arial" w:hAnsi="Arial" w:cs="Arial"/>
-        </w:rPr>
-        <w:t>-</w:t>
-      </w:r>
-      <w:proofErr w:type="spellStart"/>
-      <w:r>
-        <w:rPr>
-          <w:rFonts w:ascii="Arial" w:eastAsia="Arial" w:hAnsi="Arial" w:cs="Arial"/>
-        </w:rPr>
-        <w:t>юи</w:t>
-      </w:r>
-      <w:proofErr w:type="spellEnd"/>
-      <w:r>
-        <w:rPr>
-          <w:rFonts w:ascii="Arial" w:eastAsia="Arial" w:hAnsi="Arial" w:cs="Arial"/>
-        </w:rPr>
-        <w:t>-юнит). в неявном виде относится к качеству кода из 2 чек-поинта</w:t>
+        <w:t>можно добавить требование по покрытию тестами (на любом слое: апи-юи-юнит). в неявном виде относится к качеству кода из 2 чек-поинта</w:t>
       </w:r>
     </w:p>
   </w:comment>

</xml_diff>